<commit_message>
Update final resume documents (PDF and DOCX)
</commit_message>
<xml_diff>
--- a/assets/docs/Krish_Mistry_Resume.docx
+++ b/assets/docs/Krish_Mistry_Resume.docx
@@ -38,7 +38,7 @@
           <w:bCs/>
           <w:color w:val="1F3864" w:themeColor="accent1" w:themeShade="80"/>
         </w:rPr>
-        <w:t xml:space="preserve">| </w:t>
+        <w:t xml:space="preserve"> </w:t>
       </w:r>
       <w:hyperlink r:id="rId5" w:history="1">
         <w:r>
@@ -61,7 +61,15 @@
           <w:bCs/>
           <w:color w:val="1F3864" w:themeColor="accent1" w:themeShade="80"/>
         </w:rPr>
-        <w:t xml:space="preserve"> |</w:t>
+        <w:t xml:space="preserve"> </w:t>
+      </w:r>
+      <w:r>
+        <w:rPr>
+          <w:b/>
+          <w:bCs/>
+          <w:color w:val="1F3864" w:themeColor="accent1" w:themeShade="80"/>
+        </w:rPr>
+        <w:t>|</w:t>
       </w:r>
       <w:r>
         <w:rPr>
@@ -80,7 +88,19 @@
         <w:rPr>
           <w:color w:val="1F3864" w:themeColor="accent1" w:themeShade="80"/>
         </w:rPr>
-        <w:t xml:space="preserve"> | </w:t>
+        <w:t xml:space="preserve"> </w:t>
+      </w:r>
+      <w:r>
+        <w:rPr>
+          <w:color w:val="1F3864" w:themeColor="accent1" w:themeShade="80"/>
+        </w:rPr>
+        <w:t>|</w:t>
+      </w:r>
+      <w:r>
+        <w:rPr>
+          <w:color w:val="1F3864" w:themeColor="accent1" w:themeShade="80"/>
+        </w:rPr>
+        <w:t xml:space="preserve"> </w:t>
       </w:r>
       <w:hyperlink r:id="rId6" w:history="1">
         <w:r>
@@ -97,7 +117,15 @@
           <w:bCs/>
           <w:color w:val="1F3864" w:themeColor="accent1" w:themeShade="80"/>
         </w:rPr>
-        <w:t xml:space="preserve"> |</w:t>
+        <w:t xml:space="preserve"> </w:t>
+      </w:r>
+      <w:r>
+        <w:rPr>
+          <w:b/>
+          <w:bCs/>
+          <w:color w:val="1F3864" w:themeColor="accent1" w:themeShade="80"/>
+        </w:rPr>
+        <w:t>|</w:t>
       </w:r>
       <w:r>
         <w:rPr>
@@ -120,7 +148,7 @@
           <w:bCs/>
           <w:color w:val="1F3864" w:themeColor="accent1" w:themeShade="80"/>
         </w:rPr>
-        <w:t xml:space="preserve"> |</w:t>
+        <w:t xml:space="preserve"> </w:t>
       </w:r>
     </w:p>
     <w:p>
@@ -137,7 +165,7 @@
           <w:bCs/>
           <w:color w:val="1F3864" w:themeColor="accent1" w:themeShade="80"/>
         </w:rPr>
-        <w:t xml:space="preserve">| </w:t>
+        <w:t xml:space="preserve"> </w:t>
       </w:r>
       <w:hyperlink r:id="rId8" w:history="1">
         <w:r>
@@ -156,8 +184,6 @@
       </w:r>
       <w:r>
         <w:rPr>
-          <w:b/>
-          <w:bCs/>
           <w:color w:val="1F3864" w:themeColor="accent1" w:themeShade="80"/>
         </w:rPr>
         <w:t>|</w:t>
@@ -183,14 +209,6 @@
         </w:rPr>
         <w:t xml:space="preserve"> </w:t>
       </w:r>
-      <w:r>
-        <w:rPr>
-          <w:b/>
-          <w:bCs/>
-          <w:color w:val="1F3864" w:themeColor="accent1" w:themeShade="80"/>
-        </w:rPr>
-        <w:t>|</w:t>
-      </w:r>
     </w:p>
     <w:p>
       <w:pPr>
@@ -1417,23 +1435,7 @@
             <w:sz w:val="18"/>
             <w:szCs w:val="18"/>
           </w:rPr>
-          <w:t>GitH</w:t>
-        </w:r>
-        <w:r>
-          <w:rPr>
-            <w:rStyle w:val="Hyperlink"/>
-            <w:sz w:val="18"/>
-            <w:szCs w:val="18"/>
-          </w:rPr>
-          <w:t>u</w:t>
-        </w:r>
-        <w:r>
-          <w:rPr>
-            <w:rStyle w:val="Hyperlink"/>
-            <w:sz w:val="18"/>
-            <w:szCs w:val="18"/>
-          </w:rPr>
-          <w:t>b</w:t>
+          <w:t>GitHub</w:t>
         </w:r>
       </w:hyperlink>
     </w:p>
@@ -1763,15 +1765,7 @@
           <w:b w:val="0"/>
           <w:bCs w:val="0"/>
         </w:rPr>
-        <w:t>every four hours without manual triggering</w:t>
-      </w:r>
-      <w:r>
-        <w:rPr>
-          <w:rStyle w:val="Strong"/>
-          <w:b w:val="0"/>
-          <w:bCs w:val="0"/>
-        </w:rPr>
-        <w:t>.</w:t>
+        <w:t>every four hours without manual triggering.</w:t>
       </w:r>
     </w:p>
     <w:p>
@@ -2017,15 +2011,7 @@
           <w:b w:val="0"/>
           <w:bCs w:val="0"/>
         </w:rPr>
-        <w:t>, enabling real-time incident reporting, resource sharing, and community alerts</w:t>
-      </w:r>
-      <w:r>
-        <w:rPr>
-          <w:rStyle w:val="Strong"/>
-          <w:b w:val="0"/>
-          <w:bCs w:val="0"/>
-        </w:rPr>
-        <w:t>.</w:t>
+        <w:t>, enabling real-time incident reporting, resource sharing, and community alerts.</w:t>
       </w:r>
     </w:p>
     <w:p>
@@ -2545,7 +2531,7 @@
           <w:rFonts w:eastAsia="Times New Roman"/>
           <w:color w:val="auto"/>
         </w:rPr>
-        <w:t>Selected as Google Student Ambassadors representing SFIT in Google's Gemini Student Ambassador Program 2026 (1500+ colleges nationwide).</w:t>
+        <w:t>Selected as Google Student Ambassador representing SFIT in Google's Gemini Student Ambassador Program 2026 (1500+ colleges nationwide).</w:t>
       </w:r>
     </w:p>
     <w:p>
@@ -2566,13 +2552,6 @@
           <w:color w:val="auto"/>
         </w:rPr>
         <w:t>Promote awareness of Gemini by sharing practical AI use cases and encouraging students to explore AI tools for learning and productivity.</w:t>
-      </w:r>
-      <w:r>
-        <w:rPr>
-          <w:rFonts w:eastAsia="Times New Roman"/>
-          <w:color w:val="auto"/>
-        </w:rPr>
-        <w:t>’</w:t>
       </w:r>
     </w:p>
     <w:p>
@@ -2741,13 +2720,7 @@
         </w:tabs>
       </w:pPr>
       <w:r>
-        <w:t>Partnered with 3 NGOs</w:t>
-      </w:r>
-      <w:r>
-        <w:t>,</w:t>
-      </w:r>
-      <w:r>
-        <w:t xml:space="preserve"> Ek </w:t>
+        <w:t xml:space="preserve">Partnered with 3 NGOs, Ek </w:t>
       </w:r>
       <w:proofErr w:type="spellStart"/>
       <w:r>
@@ -3141,15 +3114,7 @@
           <w:iCs/>
           <w:color w:val="371E77"/>
         </w:rPr>
-        <w:t>Apr</w:t>
-      </w:r>
-      <w:r>
-        <w:rPr>
-          <w:i/>
-          <w:iCs/>
-          <w:color w:val="371E77"/>
-        </w:rPr>
-        <w:t xml:space="preserve"> 2025</w:t>
+        <w:t>Apr 2025</w:t>
       </w:r>
     </w:p>
     <w:p>
@@ -3232,23 +3197,7 @@
           <w:iCs/>
           <w:color w:val="371E77"/>
         </w:rPr>
-        <w:t xml:space="preserve">                                                                   Jun</w:t>
-      </w:r>
-      <w:r>
-        <w:rPr>
-          <w:i/>
-          <w:iCs/>
-          <w:color w:val="371E77"/>
-        </w:rPr>
-        <w:t xml:space="preserve"> 202</w:t>
-      </w:r>
-      <w:r>
-        <w:rPr>
-          <w:i/>
-          <w:iCs/>
-          <w:color w:val="371E77"/>
-        </w:rPr>
-        <w:t>6</w:t>
+        <w:t xml:space="preserve">                                                                   Jun 2026</w:t>
       </w:r>
     </w:p>
     <w:p>
@@ -3461,15 +3410,7 @@
           <w:iCs/>
           <w:color w:val="371E77"/>
         </w:rPr>
-        <w:t xml:space="preserve">Nov </w:t>
-      </w:r>
-      <w:r>
-        <w:rPr>
-          <w:i/>
-          <w:iCs/>
-          <w:color w:val="371E77"/>
-        </w:rPr>
-        <w:t>2025</w:t>
+        <w:t>Nov 2025</w:t>
       </w:r>
     </w:p>
     <w:p>
@@ -3528,15 +3469,7 @@
           <w:iCs/>
           <w:color w:val="371E77"/>
         </w:rPr>
-        <w:t>Oct</w:t>
-      </w:r>
-      <w:r>
-        <w:rPr>
-          <w:i/>
-          <w:iCs/>
-          <w:color w:val="371E77"/>
-        </w:rPr>
-        <w:t xml:space="preserve"> 2025</w:t>
+        <w:t>Oct 2025</w:t>
       </w:r>
     </w:p>
     <w:p>
@@ -3610,15 +3543,7 @@
           <w:iCs/>
           <w:color w:val="371E77"/>
         </w:rPr>
-        <w:t>Sep</w:t>
-      </w:r>
-      <w:r>
-        <w:rPr>
-          <w:i/>
-          <w:iCs/>
-          <w:color w:val="371E77"/>
-        </w:rPr>
-        <w:t xml:space="preserve"> 2025</w:t>
+        <w:t>Sep 2025</w:t>
       </w:r>
     </w:p>
     <w:p>
@@ -6376,6 +6301,7 @@
   <w:style w:type="character" w:default="1" w:styleId="DefaultParagraphFont">
     <w:name w:val="Default Paragraph Font"/>
     <w:uiPriority w:val="1"/>
+    <w:semiHidden/>
     <w:unhideWhenUsed/>
   </w:style>
   <w:style w:type="table" w:default="1" w:styleId="TableNormal">

</xml_diff>